<commit_message>
Add instructor feedback and revisions to Word narratives
</commit_message>
<xml_diff>
--- a/assets/algorithms/Payton_Castle_CS499_Milestone_Three_Narrative.docx
+++ b/assets/algorithms/Payton_Castle_CS499_Milestone_Three_Narrative.docx
@@ -416,6 +416,83 @@
           <w:rFonts w:ascii="Times New Roman" w:hAnsi="Times New Roman" w:cs="Times New Roman"/>
         </w:rPr>
       </w:pPr>
+    </w:p>
+    <w:p>
+      <w:pPr>
+        <w:spacing w:line="480" w:lineRule="auto"/>
+        <w:rPr>
+          <w:rFonts w:ascii="Times New Roman" w:hAnsi="Times New Roman" w:cs="Times New Roman"/>
+        </w:rPr>
+      </w:pPr>
+      <w:r>
+        <w:rPr>
+          <w:rFonts w:ascii="Times New Roman" w:hAnsi="Times New Roman" w:cs="Times New Roman"/>
+          <w:b/>
+          <w:bCs/>
+        </w:rPr>
+        <w:t>Instructor Feedback and Revisions</w:t>
+      </w:r>
+    </w:p>
+    <w:p>
+      <w:pPr>
+        <w:spacing w:line="480" w:lineRule="auto"/>
+        <w:ind w:firstLine="720"/>
+        <w:rPr>
+          <w:rFonts w:ascii="Times New Roman" w:hAnsi="Times New Roman" w:cs="Times New Roman"/>
+        </w:rPr>
+      </w:pPr>
+      <w:r>
+        <w:rPr>
+          <w:rFonts w:ascii="Times New Roman" w:hAnsi="Times New Roman" w:cs="Times New Roman"/>
+        </w:rPr>
+        <w:t xml:space="preserve">My instructor praised the stack-based indexing, the comparison between O(n) and O(n × d) processing, and my reflection on indexing feedback. The feedback asked for a few specific test results instead of only the total, and for a fuller explanation of the trade-off between removing depth limits and the extra memory or processing it requires.</w:t>
+      </w:r>
+    </w:p>
+    <w:p>
+      <w:pPr>
+        <w:spacing w:line="480" w:lineRule="auto"/>
+        <w:ind w:firstLine="720"/>
+        <w:rPr>
+          <w:rFonts w:ascii="Times New Roman" w:hAnsi="Times New Roman" w:cs="Times New Roman"/>
+        </w:rPr>
+      </w:pPr>
+      <w:r>
+        <w:rPr>
+          <w:rFonts w:ascii="Times New Roman" w:hAnsi="Times New Roman" w:cs="Times New Roman"/>
+          <w:b/>
+          <w:bCs/>
+        </w:rPr>
+        <w:t xml:space="preserve">Specific tests. </w:t>
+      </w:r>
+      <w:r>
+        <w:rPr>
+          <w:rFonts w:ascii="Times New Roman" w:hAnsi="Times New Roman" w:cs="Times New Roman"/>
+        </w:rPr>
+        <w:t xml:space="preserve">BothSearchPathsReachFortyEightLevelsAndTrackRenamesAndDeletions shows that the index and the fallback search both reach 48 nested folders, beyond the old limits of 32 and 24, and keep up with renames and deletions. LiveSubtreeScanHasNoDepthCap checks that a live scan of a subtree is not stopped by a depth cap. IndexAndCrawlCancelDuringTraversal checks that indexing and the search crawl both stop when cancelled in the middle of a traversal. BothTraversalsUseTheSameReparsePolicy checks that the index and the search treat reparse points, such as folder links, the same way.</w:t>
+      </w:r>
+    </w:p>
+    <w:p>
+      <w:pPr>
+        <w:spacing w:line="480" w:lineRule="auto"/>
+        <w:ind w:firstLine="720"/>
+        <w:rPr>
+          <w:rFonts w:ascii="Times New Roman" w:hAnsi="Times New Roman" w:cs="Times New Roman"/>
+        </w:rPr>
+      </w:pPr>
+      <w:r>
+        <w:rPr>
+          <w:rFonts w:ascii="Times New Roman" w:hAnsi="Times New Roman" w:cs="Times New Roman"/>
+          <w:b/>
+          <w:bCs/>
+        </w:rPr>
+        <w:t xml:space="preserve">The trade-off in more detail. </w:t>
+      </w:r>
+      <w:r>
+        <w:rPr>
+          <w:rFonts w:ascii="Times New Roman" w:hAnsi="Times New Roman" w:cs="Times New Roman"/>
+        </w:rPr>
+        <w:t xml:space="preserve">The old depth limits capped the work, but they also made results incomplete, and the index and the fallback search could disagree about the same folder. Without limits, a scan visits every folder, so its cost grows with the number of folders instead of stopping at a fixed depth, and the pending-folder stack or queue can hold more entries on wide trees. Choosing completeness means accepting longer scans and more memory in the worst case. I reduced that cost by letting scans be cancelled in the middle of a traversal, by keeping memory limits on the caches, and by showing the user why a scan is waiting.</w:t>
+      </w:r>
     </w:p>
     <w:sectPr>
       <w:pgSz w:w="12240" w:h="15840"/>

</xml_diff>